<commit_message>
Published new package 1.0.7
</commit_message>
<xml_diff>
--- a/Documentation/SDD_TreasuryConfirmation_Ver1.0.docx
+++ b/Documentation/SDD_TreasuryConfirmation_Ver1.0.docx
@@ -5854,10 +5854,10 @@
             <v:path o:extrusionok="f" gradientshapeok="t" o:connecttype="rect"/>
             <o:lock v:ext="edit" aspectratio="t"/>
           </v:shapetype>
-          <v:shape id="_x0000_i1025" type="#_x0000_t75" style="width:75pt;height:49.5pt" o:ole="">
+          <v:shape id="_x0000_i1027" type="#_x0000_t75" style="width:75pt;height:49.5pt" o:ole="">
             <v:imagedata r:id="rId14" o:title=""/>
           </v:shape>
-          <o:OLEObject Type="Embed" ProgID="Acrobat.Document.DC" ShapeID="_x0000_i1025" DrawAspect="Icon" ObjectID="_1718707887" r:id="rId15"/>
+          <o:OLEObject Type="Embed" ProgID="Acrobat.Document.DC" ShapeID="_x0000_i1027" DrawAspect="Icon" ObjectID="_1718709612" r:id="rId15"/>
         </w:object>
       </w:r>
     </w:p>
@@ -22319,7 +22319,12 @@
 </file>
 
 <file path=customXml/item3.xml><?xml version="1.0" encoding="utf-8"?>
-<b:Sources xmlns:b="http://schemas.openxmlformats.org/officeDocument/2006/bibliography" xmlns="http://schemas.openxmlformats.org/officeDocument/2006/bibliography" SelectedStyle="\APA.XSL" StyleName="APA Fifth Edition"/>
+<?mso-contentType ?>
+<FormTemplates xmlns="http://schemas.microsoft.com/sharepoint/v3/contenttype/forms">
+  <Display>DocumentLibraryForm</Display>
+  <Edit>DocumentLibraryForm</Edit>
+  <New>DocumentLibraryForm</New>
+</FormTemplates>
 </file>
 
 <file path=customXml/item4.xml><?xml version="1.0" encoding="utf-8"?>
@@ -22329,12 +22334,7 @@
 </file>
 
 <file path=customXml/item5.xml><?xml version="1.0" encoding="utf-8"?>
-<?mso-contentType ?>
-<FormTemplates xmlns="http://schemas.microsoft.com/sharepoint/v3/contenttype/forms">
-  <Display>DocumentLibraryForm</Display>
-  <Edit>DocumentLibraryForm</Edit>
-  <New>DocumentLibraryForm</New>
-</FormTemplates>
+<b:Sources xmlns:b="http://schemas.openxmlformats.org/officeDocument/2006/bibliography" xmlns="http://schemas.openxmlformats.org/officeDocument/2006/bibliography" SelectedStyle="\APA.XSL" StyleName="APA Fifth Edition"/>
 </file>
 
 <file path=customXml/itemProps1.xml><?xml version="1.0" encoding="utf-8"?>
@@ -22364,9 +22364,9 @@
 </file>
 
 <file path=customXml/itemProps3.xml><?xml version="1.0" encoding="utf-8"?>
-<ds:datastoreItem xmlns:ds="http://schemas.openxmlformats.org/officeDocument/2006/customXml" ds:itemID="{CD7A8C34-E8A9-42A3-AB8F-2CA947463DB0}">
+<ds:datastoreItem xmlns:ds="http://schemas.openxmlformats.org/officeDocument/2006/customXml" ds:itemID="{7A7FC2CF-7A41-47B6-847B-C17232FCB79B}">
   <ds:schemaRefs>
-    <ds:schemaRef ds:uri="http://schemas.openxmlformats.org/officeDocument/2006/bibliography"/>
+    <ds:schemaRef ds:uri="http://schemas.microsoft.com/sharepoint/v3/contenttype/forms"/>
   </ds:schemaRefs>
 </ds:datastoreItem>
 </file>
@@ -22381,9 +22381,9 @@
 </file>
 
 <file path=customXml/itemProps5.xml><?xml version="1.0" encoding="utf-8"?>
-<ds:datastoreItem xmlns:ds="http://schemas.openxmlformats.org/officeDocument/2006/customXml" ds:itemID="{7A7FC2CF-7A41-47B6-847B-C17232FCB79B}">
+<ds:datastoreItem xmlns:ds="http://schemas.openxmlformats.org/officeDocument/2006/customXml" ds:itemID="{CD7A8C34-E8A9-42A3-AB8F-2CA947463DB0}">
   <ds:schemaRefs>
-    <ds:schemaRef ds:uri="http://schemas.microsoft.com/sharepoint/v3/contenttype/forms"/>
+    <ds:schemaRef ds:uri="http://schemas.openxmlformats.org/officeDocument/2006/bibliography"/>
   </ds:schemaRefs>
 </ds:datastoreItem>
 </file>
</xml_diff>